<commit_message>
Merge Sport and Academia into single pages, renumber to 37 sections
- Sport round-up, Summer Tournament Week and Sportsman of the Year on page-12
- Academia and Scholars' Assembly on page-11
- renumber ids, nav/TOC badges, pager list, cover link and CSS selectors
- regenerate the full-text docx with the new page numbering

Co-Authored-By: Claude Sonnet 5 <noreply@anthropic.com>
Claude-Session: https://claude.ai/code/session_01JYTQLd1VExRYNntgUfkQx5
</commit_message>
<xml_diff>
--- a/Ad-Augusta-May-2026-Full-Text.docx
+++ b/Ad-Augusta-May-2026-Full-Text.docx
@@ -2330,7 +2330,7 @@
         <w:pageBreakBefore/>
       </w:pPr>
       <w:r>
-        <w:t xml:space="preserve">Page 11 — Academia</w:t>
+        <w:t xml:space="preserve">Page 11 — Academia — Results, Scholars &amp; Scholars’ Assembly</w:t>
       </w:r>
       <w:r>
         <w:rPr>
@@ -2340,7 +2340,7 @@
           <w:sz w:val="22"/>
           <w:szCs w:val="22"/>
         </w:rPr>
-        <w:t xml:space="preserve">   (original pp. 20–21)</w:t>
+        <w:t xml:space="preserve">   (original pp. 20–23)</w:t>
       </w:r>
     </w:p>
     <w:p>
@@ -3134,25 +3134,6 @@
     </w:p>
     <w:p>
       <w:pPr>
-        <w:pStyle w:val="Heading1"/>
-        <w:pageBreakBefore/>
-      </w:pPr>
-      <w:r>
-        <w:t xml:space="preserve">Page 12 — Academia — Scholars’ Assembly</w:t>
-      </w:r>
-      <w:r>
-        <w:rPr>
-          <w:b w:val="false"/>
-          <w:bCs w:val="false"/>
-          <w:color w:val="595959"/>
-          <w:sz w:val="22"/>
-          <w:szCs w:val="22"/>
-        </w:rPr>
-        <w:t xml:space="preserve">   (original pp. 22–23)</w:t>
-      </w:r>
-    </w:p>
-    <w:p>
-      <w:pPr>
         <w:keepNext/>
         <w:spacing w:after="40" w:before="240"/>
       </w:pPr>
@@ -3314,7 +3295,7 @@
         <w:pageBreakBefore/>
       </w:pPr>
       <w:r>
-        <w:t xml:space="preserve">Page 13 — Sport</w:t>
+        <w:t xml:space="preserve">Page 12 — Sport — Round-up, Summer Tournament Week &amp; Sportsman of the Year</w:t>
       </w:r>
       <w:r>
         <w:rPr>
@@ -3324,7 +3305,7 @@
           <w:sz w:val="22"/>
           <w:szCs w:val="22"/>
         </w:rPr>
-        <w:t xml:space="preserve">   (original pp. 24–25)</w:t>
+        <w:t xml:space="preserve">   (original pp. 24–27)</w:t>
       </w:r>
     </w:p>
     <w:p>
@@ -3646,25 +3627,6 @@
     </w:p>
     <w:p>
       <w:pPr>
-        <w:pStyle w:val="Heading1"/>
-        <w:pageBreakBefore/>
-      </w:pPr>
-      <w:r>
-        <w:t xml:space="preserve">Page 14 — Sport &amp; Sportsman of the Year</w:t>
-      </w:r>
-      <w:r>
-        <w:rPr>
-          <w:b w:val="false"/>
-          <w:bCs w:val="false"/>
-          <w:color w:val="595959"/>
-          <w:sz w:val="22"/>
-          <w:szCs w:val="22"/>
-        </w:rPr>
-        <w:t xml:space="preserve">   (original pp. 26–27)</w:t>
-      </w:r>
-    </w:p>
-    <w:p>
-      <w:pPr>
         <w:keepNext/>
         <w:spacing w:after="40" w:before="240"/>
       </w:pPr>
@@ -4025,7 +3987,7 @@
         <w:pageBreakBefore/>
       </w:pPr>
       <w:r>
-        <w:t xml:space="preserve">Page 15 — Extracurricular</w:t>
+        <w:t xml:space="preserve">Page 13 — Extracurricular</w:t>
       </w:r>
       <w:r>
         <w:rPr>
@@ -4303,7 +4265,7 @@
         <w:pageBreakBefore/>
       </w:pPr>
       <w:r>
-        <w:t xml:space="preserve">Page 16 — Arts and Culture</w:t>
+        <w:t xml:space="preserve">Page 14 — Arts and Culture</w:t>
       </w:r>
       <w:r>
         <w:rPr>
@@ -4595,7 +4557,7 @@
         <w:pageBreakBefore/>
       </w:pPr>
       <w:r>
-        <w:t xml:space="preserve">Page 17 — Arts and Culture &amp; International Department</w:t>
+        <w:t xml:space="preserve">Page 15 — Arts and Culture &amp; International Department</w:t>
       </w:r>
       <w:r>
         <w:rPr>
@@ -5375,7 +5337,7 @@
         <w:pageBreakBefore/>
       </w:pPr>
       <w:r>
-        <w:t xml:space="preserve">Page 18 — Staff</w:t>
+        <w:t xml:space="preserve">Page 16 — Staff</w:t>
       </w:r>
       <w:r>
         <w:rPr>
@@ -5613,7 +5575,7 @@
         <w:pageBreakBefore/>
       </w:pPr>
       <w:r>
-        <w:t xml:space="preserve">Page 19 — Staff Awards</w:t>
+        <w:t xml:space="preserve">Page 17 — Staff Awards</w:t>
       </w:r>
       <w:r>
         <w:rPr>
@@ -6428,7 +6390,7 @@
         <w:pageBreakBefore/>
       </w:pPr>
       <w:r>
-        <w:t xml:space="preserve">Page 20 — Faculty Profile: Science</w:t>
+        <w:t xml:space="preserve">Page 18 — Faculty Profile: Science</w:t>
       </w:r>
       <w:r>
         <w:rPr>
@@ -6798,7 +6760,7 @@
         <w:pageBreakBefore/>
       </w:pPr>
       <w:r>
-        <w:t xml:space="preserve">Page 21 — Events — Parents’ Evenings</w:t>
+        <w:t xml:space="preserve">Page 19 — Events — Parents’ Evenings</w:t>
       </w:r>
       <w:r>
         <w:rPr>
@@ -6935,7 +6897,7 @@
         <w:pageBreakBefore/>
       </w:pPr>
       <w:r>
-        <w:t xml:space="preserve">Page 22 — Events — Lunar New Year &amp; Boat Naming</w:t>
+        <w:t xml:space="preserve">Page 20 — Events — Lunar New Year &amp; Boat Naming</w:t>
       </w:r>
       <w:r>
         <w:rPr>
@@ -7236,7 +7198,7 @@
         <w:pageBreakBefore/>
       </w:pPr>
       <w:r>
-        <w:t xml:space="preserve">Page 23 — Upcoming Events — Gala Dinner &amp; Art House Tour</w:t>
+        <w:t xml:space="preserve">Page 21 — Upcoming Events — Gala Dinner &amp; Art House Tour</w:t>
       </w:r>
       <w:r>
         <w:rPr>
@@ -7553,7 +7515,7 @@
         <w:pageBreakBefore/>
       </w:pPr>
       <w:r>
-        <w:t xml:space="preserve">Page 24 — Giving to Grammar — Augusta Fellowship &amp; Buchanan Scholarship</w:t>
+        <w:t xml:space="preserve">Page 22 — Giving to Grammar — Augusta Fellowship &amp; Buchanan Scholarship</w:t>
       </w:r>
       <w:r>
         <w:rPr>
@@ -7751,7 +7713,7 @@
         <w:pageBreakBefore/>
       </w:pPr>
       <w:r>
-        <w:t xml:space="preserve">Page 25 — Giving to Grammar — Donor List</w:t>
+        <w:t xml:space="preserve">Page 23 — Giving to Grammar — Donor List</w:t>
       </w:r>
       <w:r>
         <w:rPr>
@@ -7921,7 +7883,7 @@
         <w:pageBreakBefore/>
       </w:pPr>
       <w:r>
-        <w:t xml:space="preserve">Page 26 — Farewell to Shiela, Lady Graham &amp; President’s Report</w:t>
+        <w:t xml:space="preserve">Page 24 — Farewell to Shiela, Lady Graham &amp; President’s Report</w:t>
       </w:r>
       <w:r>
         <w:rPr>
@@ -8166,7 +8128,7 @@
         <w:pageBreakBefore/>
       </w:pPr>
       <w:r>
-        <w:t xml:space="preserve">Page 27 — Anzac Day</w:t>
+        <w:t xml:space="preserve">Page 25 — Anzac Day</w:t>
       </w:r>
       <w:r>
         <w:rPr>
@@ -8439,7 +8401,7 @@
         <w:pageBreakBefore/>
       </w:pPr>
       <w:r>
-        <w:t xml:space="preserve">Page 28 — Augusta and Lion Awards — Nominations &amp; Recipients</w:t>
+        <w:t xml:space="preserve">Page 26 — Augusta and Lion Awards — Nominations &amp; Recipients</w:t>
       </w:r>
       <w:r>
         <w:rPr>
@@ -8915,7 +8877,7 @@
         <w:pageBreakBefore/>
       </w:pPr>
       <w:r>
-        <w:t xml:space="preserve">Page 29 — Old Boys’ News</w:t>
+        <w:t xml:space="preserve">Page 27 — Old Boys’ News</w:t>
       </w:r>
       <w:r>
         <w:rPr>
@@ -9264,7 +9226,7 @@
         <w:pageBreakBefore/>
       </w:pPr>
       <w:r>
-        <w:t xml:space="preserve">Page 30 — Old Boys’ News — Ben Barclay, Hamish Kerr &amp; Richard Douglas</w:t>
+        <w:t xml:space="preserve">Page 28 — Old Boys’ News — Ben Barclay, Hamish Kerr &amp; Richard Douglas</w:t>
       </w:r>
       <w:r>
         <w:rPr>
@@ -9530,7 +9492,7 @@
         <w:pageBreakBefore/>
       </w:pPr>
       <w:r>
-        <w:t xml:space="preserve">Page 31 — Old Boys’ News</w:t>
+        <w:t xml:space="preserve">Page 29 — Old Boys’ News</w:t>
       </w:r>
       <w:r>
         <w:rPr>
@@ -9942,7 +9904,7 @@
         <w:pageBreakBefore/>
       </w:pPr>
       <w:r>
-        <w:t xml:space="preserve">Page 32 — News &amp; History</w:t>
+        <w:t xml:space="preserve">Page 30 — News &amp; History</w:t>
       </w:r>
       <w:r>
         <w:rPr>
@@ -10223,7 +10185,7 @@
         <w:pageBreakBefore/>
       </w:pPr>
       <w:r>
-        <w:t xml:space="preserve">Page 33 — International News</w:t>
+        <w:t xml:space="preserve">Page 31 — International News</w:t>
       </w:r>
       <w:r>
         <w:rPr>
@@ -10568,7 +10530,7 @@
         <w:pageBreakBefore/>
       </w:pPr>
       <w:r>
-        <w:t xml:space="preserve">Page 34 — Grammar Families</w:t>
+        <w:t xml:space="preserve">Page 32 — Grammar Families</w:t>
       </w:r>
       <w:r>
         <w:rPr>
@@ -10806,7 +10768,7 @@
         <w:pageBreakBefore/>
       </w:pPr>
       <w:r>
-        <w:t xml:space="preserve">Page 35 — Obituaries</w:t>
+        <w:t xml:space="preserve">Page 33 — Obituaries</w:t>
       </w:r>
       <w:r>
         <w:rPr>
@@ -11024,7 +10986,7 @@
         <w:pageBreakBefore/>
       </w:pPr>
       <w:r>
-        <w:t xml:space="preserve">Page 36 — Obituaries &amp; In Memoriam</w:t>
+        <w:t xml:space="preserve">Page 34 — Obituaries &amp; In Memoriam</w:t>
       </w:r>
       <w:r>
         <w:rPr>
@@ -11165,7 +11127,7 @@
         <w:pageBreakBefore/>
       </w:pPr>
       <w:r>
-        <w:t xml:space="preserve">Page 37 — From the Archives</w:t>
+        <w:t xml:space="preserve">Page 35 — From the Archives</w:t>
       </w:r>
       <w:r>
         <w:rPr>
@@ -11508,7 +11470,7 @@
         <w:pageBreakBefore/>
       </w:pPr>
       <w:r>
-        <w:t xml:space="preserve">Page 38 — Combined Decade Reunion &amp; Partners</w:t>
+        <w:t xml:space="preserve">Page 36 — Combined Decade Reunion &amp; Partners</w:t>
       </w:r>
       <w:r>
         <w:rPr>
@@ -11578,7 +11540,7 @@
         <w:pageBreakBefore/>
       </w:pPr>
       <w:r>
-        <w:t xml:space="preserve">Page 39 — Back Cover</w:t>
+        <w:t xml:space="preserve">Page 37 — Back Cover</w:t>
       </w:r>
       <w:r>
         <w:rPr>

</xml_diff>